<commit_message>
terminei o trabalho de PW nenem
</commit_message>
<xml_diff>
--- a/1DS-A-PW-I-HO-HenriqueGarciasdeOliveira.docx
+++ b/1DS-A-PW-I-HO-HenriqueGarciasdeOliveira.docx
@@ -882,13 +882,15 @@
           <w:i/>
           <w:iCs/>
           <w:color w:val="3B3838" w:themeColor="background2" w:themeShade="40"/>
-        </w:rPr>
-      </w:pPr>
-      <w:r>
-        <w:rPr>
-          <w:i/>
-          <w:iCs/>
-          <w:color w:val="3B3838" w:themeColor="background2" w:themeShade="40"/>
+          <w:lang w:val="en-US"/>
+        </w:rPr>
+      </w:pPr>
+      <w:r>
+        <w:rPr>
+          <w:i/>
+          <w:iCs/>
+          <w:color w:val="3B3838" w:themeColor="background2" w:themeShade="40"/>
+          <w:lang w:val="en-US"/>
         </w:rPr>
         <w:t>&lt;body&gt;</w:t>
       </w:r>
@@ -899,13 +901,15 @@
           <w:i/>
           <w:iCs/>
           <w:color w:val="3B3838" w:themeColor="background2" w:themeShade="40"/>
-        </w:rPr>
-      </w:pPr>
-      <w:r>
-        <w:rPr>
-          <w:i/>
-          <w:iCs/>
-          <w:color w:val="3B3838" w:themeColor="background2" w:themeShade="40"/>
+          <w:lang w:val="en-US"/>
+        </w:rPr>
+      </w:pPr>
+      <w:r>
+        <w:rPr>
+          <w:i/>
+          <w:iCs/>
+          <w:color w:val="3B3838" w:themeColor="background2" w:themeShade="40"/>
+          <w:lang w:val="en-US"/>
         </w:rPr>
         <w:tab/>
         <w:t>&lt;header&gt;</w:t>
@@ -917,13 +921,15 @@
           <w:i/>
           <w:iCs/>
           <w:color w:val="3B3838" w:themeColor="background2" w:themeShade="40"/>
-        </w:rPr>
-      </w:pPr>
-      <w:r>
-        <w:rPr>
-          <w:i/>
-          <w:iCs/>
-          <w:color w:val="3B3838" w:themeColor="background2" w:themeShade="40"/>
+          <w:lang w:val="en-US"/>
+        </w:rPr>
+      </w:pPr>
+      <w:r>
+        <w:rPr>
+          <w:i/>
+          <w:iCs/>
+          <w:color w:val="3B3838" w:themeColor="background2" w:themeShade="40"/>
+          <w:lang w:val="en-US"/>
         </w:rPr>
         <w:tab/>
       </w:r>
@@ -932,6 +938,7 @@
           <w:i/>
           <w:iCs/>
           <w:color w:val="3B3838" w:themeColor="background2" w:themeShade="40"/>
+          <w:lang w:val="en-US"/>
         </w:rPr>
         <w:tab/>
       </w:r>
@@ -940,6 +947,7 @@
           <w:i/>
           <w:iCs/>
           <w:color w:val="3B3838" w:themeColor="background2" w:themeShade="40"/>
+          <w:lang w:val="en-US"/>
         </w:rPr>
         <w:t>&lt;nav&gt;</w:t>
       </w:r>
@@ -952,13 +960,15 @@
           <w:i/>
           <w:iCs/>
           <w:color w:val="3B3838" w:themeColor="background2" w:themeShade="40"/>
-        </w:rPr>
-      </w:pPr>
-      <w:r>
-        <w:rPr>
-          <w:i/>
-          <w:iCs/>
-          <w:color w:val="3B3838" w:themeColor="background2" w:themeShade="40"/>
+          <w:lang w:val="en-US"/>
+        </w:rPr>
+      </w:pPr>
+      <w:r>
+        <w:rPr>
+          <w:i/>
+          <w:iCs/>
+          <w:color w:val="3B3838" w:themeColor="background2" w:themeShade="40"/>
+          <w:lang w:val="en-US"/>
         </w:rPr>
         <w:tab/>
       </w:r>
@@ -967,6 +977,7 @@
           <w:i/>
           <w:iCs/>
           <w:color w:val="3B3838" w:themeColor="background2" w:themeShade="40"/>
+          <w:lang w:val="en-US"/>
         </w:rPr>
         <w:tab/>
       </w:r>
@@ -975,6 +986,7 @@
           <w:i/>
           <w:iCs/>
           <w:color w:val="3B3838" w:themeColor="background2" w:themeShade="40"/>
+          <w:lang w:val="en-US"/>
         </w:rPr>
         <w:tab/>
       </w:r>
@@ -985,6 +997,7 @@
           <w:i/>
           <w:iCs/>
           <w:color w:val="3B3838" w:themeColor="background2" w:themeShade="40"/>
+          <w:lang w:val="en-US"/>
         </w:rPr>
         <w:t>&lt;a</w:t>
       </w:r>
@@ -995,6 +1008,7 @@
           <w:i/>
           <w:iCs/>
           <w:color w:val="3B3838" w:themeColor="background2" w:themeShade="40"/>
+          <w:lang w:val="en-US"/>
         </w:rPr>
         <w:t xml:space="preserve"> href=”#teclado”&gt;Teclados&lt;/a&gt;</w:t>
       </w:r>
@@ -1134,15 +1148,13 @@
           <w:i/>
           <w:iCs/>
           <w:color w:val="3B3838" w:themeColor="background2" w:themeShade="40"/>
-          <w:lang w:val="en-US"/>
-        </w:rPr>
-      </w:pPr>
-      <w:r>
-        <w:rPr>
-          <w:i/>
-          <w:iCs/>
-          <w:color w:val="3B3838" w:themeColor="background2" w:themeShade="40"/>
-          <w:lang w:val="en-US"/>
+        </w:rPr>
+      </w:pPr>
+      <w:r>
+        <w:rPr>
+          <w:i/>
+          <w:iCs/>
+          <w:color w:val="3B3838" w:themeColor="background2" w:themeShade="40"/>
         </w:rPr>
         <w:t>&lt;/body&gt;</w:t>
       </w:r>
@@ -1914,23 +1926,7 @@
           <w:iCs/>
           <w:color w:val="3B3838" w:themeColor="background2" w:themeShade="40"/>
         </w:rPr>
-        <w:t>“</w:t>
-      </w:r>
-      <w:r>
-        <w:rPr>
-          <w:i/>
-          <w:iCs/>
-          <w:color w:val="3B3838" w:themeColor="background2" w:themeShade="40"/>
-        </w:rPr>
-        <w:t>alt</w:t>
-      </w:r>
-      <w:r>
-        <w:rPr>
-          <w:i/>
-          <w:iCs/>
-          <w:color w:val="3B3838" w:themeColor="background2" w:themeShade="40"/>
-        </w:rPr>
-        <w:t xml:space="preserve">” </w:t>
+        <w:t xml:space="preserve">“alt” </w:t>
       </w:r>
       <w:r>
         <w:rPr>
@@ -2483,8 +2479,49 @@
           <w:iCs/>
           <w:color w:val="3B3838" w:themeColor="background2" w:themeShade="40"/>
         </w:rPr>
-        <w:t xml:space="preserve"> ela serve para criar listas dentro de tabelas.</w:t>
-      </w:r>
+        <w:t xml:space="preserve"> ela serve para criar listas </w:t>
+      </w:r>
+      <w:r>
+        <w:rPr>
+          <w:i/>
+          <w:iCs/>
+          <w:color w:val="3B3838" w:themeColor="background2" w:themeShade="40"/>
+        </w:rPr>
+        <w:t>não ordenadas dentro de tabelas</w:t>
+      </w:r>
+      <w:r>
+        <w:rPr>
+          <w:i/>
+          <w:iCs/>
+          <w:color w:val="3B3838" w:themeColor="background2" w:themeShade="40"/>
+        </w:rPr>
+        <w:t xml:space="preserve">. Elas ajudam a listar coisas dentro de tabelas, se não usasse elas, teríamos que fazer </w:t>
+      </w:r>
+      <w:r>
+        <w:rPr>
+          <w:i/>
+          <w:iCs/>
+          <w:color w:val="3B3838" w:themeColor="background2" w:themeShade="40"/>
+        </w:rPr>
+        <w:t>um &lt;td&gt; pegar várias linhas e na mesma linha desse &lt;td&gt; colocar os dados, já com o &lt;ul&gt; não, precisa, basta apenas criar a lista e colocar tudo dentro de um único &lt;</w:t>
+      </w:r>
+      <w:r>
+        <w:rPr>
+          <w:i/>
+          <w:iCs/>
+          <w:color w:val="3B3838" w:themeColor="background2" w:themeShade="40"/>
+        </w:rPr>
+        <w:t>td&gt;</w:t>
+      </w:r>
+    </w:p>
+    <w:p>
+      <w:pPr>
+        <w:rPr>
+          <w:i/>
+          <w:iCs/>
+          <w:color w:val="3B3838" w:themeColor="background2" w:themeShade="40"/>
+        </w:rPr>
+      </w:pPr>
     </w:p>
     <w:p>
       <w:pPr>
@@ -2494,6 +2531,7 @@
         </w:rPr>
       </w:pPr>
       <w:r>
+        <w:lastRenderedPageBreak/>
         <w:br/>
       </w:r>
       <w:r>
@@ -2519,16 +2557,40 @@
           <w:i/>
           <w:iCs/>
           <w:color w:val="3B3838" w:themeColor="background2" w:themeShade="40"/>
-        </w:rPr>
-      </w:pPr>
-      <w:r>
-        <w:rPr>
-          <w:i/>
-          <w:iCs/>
-          <w:color w:val="3B3838" w:themeColor="background2" w:themeShade="40"/>
-        </w:rPr>
-        <w:lastRenderedPageBreak/>
+          <w:u w:val="single"/>
+        </w:rPr>
+      </w:pPr>
+      <w:r>
+        <w:rPr>
+          <w:i/>
+          <w:iCs/>
+          <w:color w:val="3B3838" w:themeColor="background2" w:themeShade="40"/>
+        </w:rPr>
         <w:t>Resposta:</w:t>
+      </w:r>
+      <w:r>
+        <w:rPr>
+          <w:i/>
+          <w:iCs/>
+          <w:color w:val="3B3838" w:themeColor="background2" w:themeShade="40"/>
+        </w:rPr>
+        <w:t xml:space="preserve"> Elas servem para organizar a página entre cabeçalho, corpo/conteúdo principal e </w:t>
+      </w:r>
+      <w:r>
+        <w:rPr>
+          <w:i/>
+          <w:iCs/>
+          <w:color w:val="3B3838" w:themeColor="background2" w:themeShade="40"/>
+        </w:rPr>
+        <w:t xml:space="preserve">rodapé, eles ajudam na organização do código também, sendo muito mais fácil de localizar </w:t>
+      </w:r>
+      <w:r>
+        <w:rPr>
+          <w:i/>
+          <w:iCs/>
+          <w:color w:val="3B3838" w:themeColor="background2" w:themeShade="40"/>
+        </w:rPr>
+        <w:t>outras tags importantes, além da semântica necessária para qualquer página web.</w:t>
       </w:r>
     </w:p>
     <w:p/>
@@ -2632,6 +2694,7 @@
     <w:sdtPr>
       <w:id w:val="-1985767450"/>
     </w:sdtPr>
+    <w:sdtEndPr/>
     <w:sdtContent>
       <w:p>
         <w:pPr>
@@ -5422,6 +5485,21 @@
 </file>
 
 <file path=customXml/item1.xml><?xml version="1.0" encoding="utf-8"?>
+<p:properties xmlns:p="http://schemas.microsoft.com/office/2006/metadata/properties" xmlns:xsi="http://www.w3.org/2001/XMLSchema-instance" xmlns:pc="http://schemas.microsoft.com/office/infopath/2007/PartnerControls">
+  <documentManagement/>
+</p:properties>
+</file>
+
+<file path=customXml/item2.xml><?xml version="1.0" encoding="utf-8"?>
+<?mso-contentType ?>
+<FormTemplates xmlns="http://schemas.microsoft.com/sharepoint/v3/contenttype/forms">
+  <Display>DocumentLibraryForm</Display>
+  <Edit>DocumentLibraryForm</Edit>
+  <New>DocumentLibraryForm</New>
+</FormTemplates>
+</file>
+
+<file path=customXml/item3.xml><?xml version="1.0" encoding="utf-8"?>
 <ct:contentTypeSchema xmlns:ct="http://schemas.microsoft.com/office/2006/metadata/contentType" xmlns:ma="http://schemas.microsoft.com/office/2006/metadata/properties/metaAttributes" ct:_="" ma:_="" ma:contentTypeName="Documento" ma:contentTypeID="0x0101002F893FB7E8284041B6B8A6A360F53EFF" ma:contentTypeVersion="4" ma:contentTypeDescription="Crie um novo documento." ma:contentTypeScope="" ma:versionID="5c5156d5bd7147db6e26006aab91b74e">
   <xsd:schema xmlns:xsd="http://www.w3.org/2001/XMLSchema" xmlns:xs="http://www.w3.org/2001/XMLSchema" xmlns:p="http://schemas.microsoft.com/office/2006/metadata/properties" xmlns:ns2="863447bc-34f3-4a6b-b866-50a6bb9243f2" targetNamespace="http://schemas.microsoft.com/office/2006/metadata/properties" ma:root="true" ma:fieldsID="7de0fd6e29da6c0a192154e30cff9780" ns2:_="">
     <xsd:import namespace="863447bc-34f3-4a6b-b866-50a6bb9243f2"/>
@@ -5565,22 +5643,24 @@
 </ct:contentTypeSchema>
 </file>
 
-<file path=customXml/item2.xml><?xml version="1.0" encoding="utf-8"?>
-<?mso-contentType ?>
-<FormTemplates xmlns="http://schemas.microsoft.com/sharepoint/v3/contenttype/forms">
-  <Display>DocumentLibraryForm</Display>
-  <Edit>DocumentLibraryForm</Edit>
-  <New>DocumentLibraryForm</New>
-</FormTemplates>
+<file path=customXml/itemProps1.xml><?xml version="1.0" encoding="utf-8"?>
+<ds:datastoreItem xmlns:ds="http://schemas.openxmlformats.org/officeDocument/2006/customXml" ds:itemID="{5BB85837-D582-4FB0-9D24-008F4312C296}">
+  <ds:schemaRefs>
+    <ds:schemaRef ds:uri="http://schemas.microsoft.com/office/2006/metadata/properties"/>
+    <ds:schemaRef ds:uri="http://schemas.microsoft.com/office/infopath/2007/PartnerControls"/>
+  </ds:schemaRefs>
+</ds:datastoreItem>
 </file>
 
-<file path=customXml/item3.xml><?xml version="1.0" encoding="utf-8"?>
-<p:properties xmlns:p="http://schemas.microsoft.com/office/2006/metadata/properties" xmlns:xsi="http://www.w3.org/2001/XMLSchema-instance" xmlns:pc="http://schemas.microsoft.com/office/infopath/2007/PartnerControls">
-  <documentManagement/>
-</p:properties>
+<file path=customXml/itemProps2.xml><?xml version="1.0" encoding="utf-8"?>
+<ds:datastoreItem xmlns:ds="http://schemas.openxmlformats.org/officeDocument/2006/customXml" ds:itemID="{FFA19B00-492B-4B88-B377-EA5096F7ED3A}">
+  <ds:schemaRefs>
+    <ds:schemaRef ds:uri="http://schemas.microsoft.com/sharepoint/v3/contenttype/forms"/>
+  </ds:schemaRefs>
+</ds:datastoreItem>
 </file>
 
-<file path=customXml/itemProps1.xml><?xml version="1.0" encoding="utf-8"?>
+<file path=customXml/itemProps3.xml><?xml version="1.0" encoding="utf-8"?>
 <ds:datastoreItem xmlns:ds="http://schemas.openxmlformats.org/officeDocument/2006/customXml" ds:itemID="{1AF9DDD3-38F0-439C-A2D3-3FF4AD9CEE75}">
   <ds:schemaRefs>
     <ds:schemaRef ds:uri="http://schemas.microsoft.com/office/2006/metadata/contentType"/>
@@ -5596,21 +5676,4 @@
     <ds:schemaRef ds:uri="http://schemas.microsoft.com/internal/obd"/>
   </ds:schemaRefs>
 </ds:datastoreItem>
-</file>
-
-<file path=customXml/itemProps2.xml><?xml version="1.0" encoding="utf-8"?>
-<ds:datastoreItem xmlns:ds="http://schemas.openxmlformats.org/officeDocument/2006/customXml" ds:itemID="{FFA19B00-492B-4B88-B377-EA5096F7ED3A}">
-  <ds:schemaRefs>
-    <ds:schemaRef ds:uri="http://schemas.microsoft.com/sharepoint/v3/contenttype/forms"/>
-  </ds:schemaRefs>
-</ds:datastoreItem>
-</file>
-
-<file path=customXml/itemProps3.xml><?xml version="1.0" encoding="utf-8"?>
-<ds:datastoreItem xmlns:ds="http://schemas.openxmlformats.org/officeDocument/2006/customXml" ds:itemID="{5BB85837-D582-4FB0-9D24-008F4312C296}">
-  <ds:schemaRefs>
-    <ds:schemaRef ds:uri="http://schemas.microsoft.com/office/2006/metadata/properties"/>
-    <ds:schemaRef ds:uri="http://schemas.microsoft.com/office/infopath/2007/PartnerControls"/>
-  </ds:schemaRefs>
-</ds:datastoreItem>
 </file>
</xml_diff>